<commit_message>
Fig 6b: Si feedback off/reference/stronger at the reference site (v22, 10 yr); figures docx updated
Co-Authored-By: Claude Opus 5.5 <noreply@anthropic.com>
Claude-Session: https://claude.ai/code/session_011eE6rAt4DAy7w44Js7Frnz
</commit_message>
<xml_diff>
--- a/manuscript_gmd/Riceland_SCEPTER_GMD_figures_v22_2026-10-30.docx
+++ b/manuscript_gmd/Riceland_SCEPTER_GMD_figures_v22_2026-10-30.docx
@@ -15,7 +15,7 @@
         <w:pStyle w:val="BodyText"/>
       </w:pPr>
       <w:r>
-        <w:t>All panels use executable scepter_paddy_v22 (commit 162913a), k_cal.in (methanogenesis vmax 1860 yr⁻¹) and the Si feedback K_Si = 2 mmol L⁻¹, w = 0.2, with no site recalibration, except where a panel says otherwise. Fig. 6 is a placeholder until the v22 Morris screen and the Si-feedback runs finish.</w:t>
+        <w:t>All panels use executable scepter_paddy_v22 (commit 162913a), k_cal.in (methanogenesis vmax 1860 yr⁻¹) and the Si feedback K_Si = 2 mmol L⁻¹, w = 0.2, with no site recalibration, except where a panel says otherwise. Fig. 6a is a placeholder (model v16) until the v22 Morris screen finishes; Fig. 6b is v22.</w:t>
       </w:r>
     </w:p>
     <w:p>
@@ -294,10 +294,49 @@
     </w:p>
     <w:p>
       <w:pPr>
+        <w:pStyle w:val="CaptionedFigure"/>
+      </w:pPr>
+      <w:r>
+        <w:drawing>
+          <wp:inline xmlns:a="http://schemas.openxmlformats.org/drawingml/2006/main" xmlns:pic="http://schemas.openxmlformats.org/drawingml/2006/picture">
+            <wp:extent cx="5868000" cy="1721280"/>
+            <wp:docPr id="7" name="Picture 7"/>
+            <wp:cNvGraphicFramePr>
+              <a:graphicFrameLocks noChangeAspect="1"/>
+            </wp:cNvGraphicFramePr>
+            <a:graphic>
+              <a:graphicData uri="http://schemas.openxmlformats.org/drawingml/2006/picture">
+                <pic:pic>
+                  <pic:nvPicPr>
+                    <pic:cNvPr id="0" name="fig6b_si_v22.png"/>
+                    <pic:cNvPicPr/>
+                  </pic:nvPicPr>
+                  <pic:blipFill>
+                    <a:blip r:embed="rId16"/>
+                    <a:stretch>
+                      <a:fillRect/>
+                    </a:stretch>
+                  </pic:blipFill>
+                  <pic:spPr>
+                    <a:xfrm>
+                      <a:off x="0" y="0"/>
+                      <a:ext cx="5868000" cy="1721280"/>
+                    </a:xfrm>
+                    <a:prstGeom prst="rect"/>
+                  </pic:spPr>
+                </pic:pic>
+              </a:graphicData>
+            </a:graphic>
+          </wp:inline>
+        </w:drawing>
+      </w:r>
+    </w:p>
+    <w:p>
+      <w:pPr>
         <w:pStyle w:val="ImageCaption"/>
       </w:pPr>
       <w:r>
-        <w:t>Fig. 6 (PLACEHOLDER: model v16, superseded; not a v22 result). Parameter sensitivity and structural uncertainty in simulated CH₄ emissions. The final figure will have two panels. (a) Morris elementary effects on v22 (11 factors, 96 points, 7-yr settle, year-matched controls), shown separately for baseline CH₄ (control) and for the basalt-induced change; this screen is running now. (b) Si feedback off (w = 0), reference (w = 0.2) and stronger (w = 0.4) at the reference site over 10 years at 0, 10 and 20 t ha⁻¹ yr⁻¹; these runs are also in progress. Morris explores sensitivity within the assumed structure; it cannot show that the Si–root-O₂ mechanism is correct.</w:t>
+        <w:t>Fig. 6. Parameter sensitivity and structural uncertainty in simulated CH₄ emissions. (a) PLACEHOLDER, model v16 (superseded; not a v22 result): Morris elementary effects. The v22 screen is running (11 factors, 96 points, 7-yr settle, year-matched controls) and will show baseline CH₄ (control) separately from the basalt-induced change. Morris explores sensitivity within the assumed model structure; it cannot show that the Si–root-O₂ mechanism is correct. (b) Structural test of the empirical Si feedback at the reference site over 10 years (v22; each treatment against a control run with the same w): Si feedback off (w = 0), v22 reference (w = 0.2) and stronger (w = 0.4). (b1) Control CH₄ hardly depends on w (130–131 kg ha⁻¹ in year 1), so the baseline is set by other processes. (b2) The first-year CH₄ response to basalt depends almost entirely on w: −2% with w = 0 against −37 to −44% (w = 0.2) and −59 to −66% (w = 0.4). Without the feedback, CH₄ still falls over the years (to −36% at 10 t and −50% at 20 t ha⁻¹ yr⁻¹ by year 10), partly because the control’s CH₄ rises as its plough-layer Fe(III) declines. (b3) Net GHG change over 10 years remains negative in all three cases: −19, −32 and −42 t CO₂e ha⁻¹ at 10 t ha⁻¹ yr⁻¹, and −38, −50 and −59 at 20 t ha⁻¹ yr⁻¹, for w = 0, 0.2 and 0.4.</w:t>
       </w:r>
     </w:p>
     <w:p>
@@ -308,7 +347,7 @@
         <w:drawing>
           <wp:inline xmlns:a="http://schemas.openxmlformats.org/drawingml/2006/main" xmlns:pic="http://schemas.openxmlformats.org/drawingml/2006/picture">
             <wp:extent cx="5868000" cy="1799520"/>
-            <wp:docPr id="7" name="Picture 7"/>
+            <wp:docPr id="8" name="Picture 8"/>
             <wp:cNvGraphicFramePr>
               <a:graphicFrameLocks noChangeAspect="1"/>
             </wp:cNvGraphicFramePr>
@@ -320,7 +359,7 @@
                     <pic:cNvPicPr/>
                   </pic:nvPicPr>
                   <pic:blipFill>
-                    <a:blip r:embed="rId16"/>
+                    <a:blip r:embed="rId17"/>
                     <a:stretch>
                       <a:fillRect/>
                     </a:stretch>
@@ -355,7 +394,7 @@
         <w:drawing>
           <wp:inline xmlns:a="http://schemas.openxmlformats.org/drawingml/2006/main" xmlns:pic="http://schemas.openxmlformats.org/drawingml/2006/picture">
             <wp:extent cx="5868000" cy="2211785"/>
-            <wp:docPr id="8" name="Picture 8"/>
+            <wp:docPr id="9" name="Picture 9"/>
             <wp:cNvGraphicFramePr>
               <a:graphicFrameLocks noChangeAspect="1"/>
             </wp:cNvGraphicFramePr>
@@ -367,7 +406,7 @@
                     <pic:cNvPicPr/>
                   </pic:nvPicPr>
                   <pic:blipFill>
-                    <a:blip r:embed="rId17"/>
+                    <a:blip r:embed="rId18"/>
                     <a:stretch>
                       <a:fillRect/>
                     </a:stretch>

</xml_diff>